<commit_message>
fixed title page (#23)
</commit_message>
<xml_diff>
--- a/documents/project_concept.docx
+++ b/documents/project_concept.docx
@@ -355,6 +355,8 @@
           <w:sz w:val="28"/>
         </w:rPr>
       </w:pPr>
+      <w:bookmarkStart w:id="0" w:name="_GoBack"/>
+      <w:bookmarkEnd w:id="0"/>
     </w:p>
     <w:p>
       <w:pPr>
@@ -516,7 +518,6 @@
     <w:p/>
     <w:p>
       <w:pPr>
-        <w:spacing w:after="0" w:line="360" w:lineRule="auto"/>
         <w:ind w:left="5812"/>
         <w:rPr>
           <w:b/>
@@ -533,7 +534,6 @@
     </w:p>
     <w:p>
       <w:pPr>
-        <w:spacing w:after="0" w:line="360" w:lineRule="auto"/>
         <w:ind w:left="5812"/>
       </w:pPr>
       <w:r>
@@ -542,7 +542,6 @@
     </w:p>
     <w:p>
       <w:pPr>
-        <w:spacing w:after="0" w:line="360" w:lineRule="auto"/>
         <w:ind w:left="5812"/>
       </w:pPr>
       <w:proofErr w:type="spellStart"/>
@@ -556,7 +555,6 @@
     </w:p>
     <w:p>
       <w:pPr>
-        <w:spacing w:after="0" w:line="360" w:lineRule="auto"/>
         <w:ind w:left="5812"/>
       </w:pPr>
       <w:r>
@@ -565,7 +563,6 @@
     </w:p>
     <w:p>
       <w:pPr>
-        <w:spacing w:after="0" w:line="360" w:lineRule="auto"/>
         <w:ind w:left="5812"/>
       </w:pPr>
       <w:r>
@@ -574,7 +571,6 @@
     </w:p>
     <w:p>
       <w:pPr>
-        <w:spacing w:after="0" w:line="360" w:lineRule="auto"/>
         <w:ind w:left="5812"/>
       </w:pPr>
       <w:r>
@@ -583,7 +579,6 @@
     </w:p>
     <w:p>
       <w:pPr>
-        <w:spacing w:after="0" w:line="360" w:lineRule="auto"/>
         <w:ind w:left="5812"/>
       </w:pPr>
       <w:r>
@@ -592,7 +587,7 @@
     </w:p>
     <w:p>
       <w:pPr>
-        <w:spacing w:before="240" w:after="0" w:line="360" w:lineRule="auto"/>
+        <w:spacing w:before="240"/>
         <w:ind w:left="5812"/>
         <w:rPr>
           <w:b/>
@@ -609,7 +604,6 @@
     </w:p>
     <w:p>
       <w:pPr>
-        <w:spacing w:after="0" w:line="360" w:lineRule="auto"/>
         <w:ind w:left="5812"/>
       </w:pPr>
       <w:r>
@@ -627,7 +621,6 @@
     </w:p>
     <w:p>
       <w:pPr>
-        <w:spacing w:after="0" w:line="360" w:lineRule="auto"/>
         <w:ind w:left="5812"/>
       </w:pPr>
       <w:r>
@@ -636,7 +629,6 @@
     </w:p>
     <w:p>
       <w:pPr>
-        <w:spacing w:after="0" w:line="360" w:lineRule="auto"/>
         <w:ind w:left="5812"/>
       </w:pPr>
       <w:r>
@@ -695,10 +687,10 @@
         <w:t>Содержание</w:t>
       </w:r>
     </w:p>
-    <w:bookmarkStart w:id="0" w:name="_Toc114815999"/>
-    <w:bookmarkStart w:id="1" w:name="_Toc114823010"/>
-    <w:bookmarkStart w:id="2" w:name="_Toc115845556"/>
-    <w:bookmarkStart w:id="3" w:name="_Toc115845555"/>
+    <w:bookmarkStart w:id="1" w:name="_Toc114815999"/>
+    <w:bookmarkStart w:id="2" w:name="_Toc114823010"/>
+    <w:bookmarkStart w:id="3" w:name="_Toc115845556"/>
+    <w:bookmarkStart w:id="4" w:name="_Toc115845555"/>
     <w:p>
       <w:pPr>
         <w:pStyle w:val="11"/>
@@ -2798,7 +2790,7 @@
         </w:rPr>
         <w:br w:type="page"/>
       </w:r>
-      <w:bookmarkStart w:id="4" w:name="_Toc215160496"/>
+      <w:bookmarkStart w:id="5" w:name="_Toc215160496"/>
       <w:r>
         <w:rPr>
           <w:rFonts w:ascii="Times New Roman" w:hAnsi="Times New Roman"/>
@@ -2816,7 +2808,7 @@
         </w:rPr>
         <w:t xml:space="preserve"> проекта</w:t>
       </w:r>
-      <w:bookmarkEnd w:id="4"/>
+      <w:bookmarkEnd w:id="5"/>
     </w:p>
     <w:p>
       <w:pPr>
@@ -2827,7 +2819,7 @@
           <w:szCs w:val="28"/>
         </w:rPr>
       </w:pPr>
-      <w:bookmarkStart w:id="5" w:name="_Toc215160497"/>
+      <w:bookmarkStart w:id="6" w:name="_Toc215160497"/>
       <w:r>
         <w:rPr>
           <w:sz w:val="28"/>
@@ -2835,7 +2827,7 @@
         </w:rPr>
         <w:t>Обоснование необходимости</w:t>
       </w:r>
-      <w:bookmarkEnd w:id="5"/>
+      <w:bookmarkEnd w:id="6"/>
     </w:p>
     <w:p>
       <w:pPr>
@@ -2855,7 +2847,7 @@
           <w:szCs w:val="28"/>
         </w:rPr>
       </w:pPr>
-      <w:bookmarkStart w:id="6" w:name="_Toc215160498"/>
+      <w:bookmarkStart w:id="7" w:name="_Toc215160498"/>
       <w:r>
         <w:rPr>
           <w:sz w:val="28"/>
@@ -2863,7 +2855,7 @@
         </w:rPr>
         <w:t>Видение проекта</w:t>
       </w:r>
-      <w:bookmarkEnd w:id="6"/>
+      <w:bookmarkEnd w:id="7"/>
     </w:p>
     <w:p>
       <w:pPr>
@@ -2890,7 +2882,7 @@
           <w:lang w:val="en-US"/>
         </w:rPr>
       </w:pPr>
-      <w:bookmarkStart w:id="7" w:name="_Toc215160499"/>
+      <w:bookmarkStart w:id="8" w:name="_Toc215160499"/>
       <w:r>
         <w:rPr>
           <w:sz w:val="28"/>
@@ -2913,7 +2905,7 @@
         </w:rPr>
         <w:t>выгод</w:t>
       </w:r>
-      <w:bookmarkEnd w:id="7"/>
+      <w:bookmarkEnd w:id="8"/>
     </w:p>
     <w:p>
       <w:pPr>
@@ -3124,7 +3116,7 @@
           <w:szCs w:val="32"/>
         </w:rPr>
       </w:pPr>
-      <w:bookmarkStart w:id="8" w:name="_Toc215160500"/>
+      <w:bookmarkStart w:id="9" w:name="_Toc215160500"/>
       <w:r>
         <w:rPr>
           <w:rFonts w:ascii="Times New Roman" w:hAnsi="Times New Roman"/>
@@ -3151,7 +3143,7 @@
         </w:rPr>
         <w:t>решения</w:t>
       </w:r>
-      <w:bookmarkEnd w:id="8"/>
+      <w:bookmarkEnd w:id="9"/>
     </w:p>
     <w:p>
       <w:pPr>
@@ -3162,7 +3154,7 @@
           <w:szCs w:val="28"/>
         </w:rPr>
       </w:pPr>
-      <w:bookmarkStart w:id="9" w:name="_Toc215160501"/>
+      <w:bookmarkStart w:id="10" w:name="_Toc215160501"/>
       <w:r>
         <w:rPr>
           <w:sz w:val="28"/>
@@ -3184,7 +3176,7 @@
         </w:rPr>
         <w:t>Задачи</w:t>
       </w:r>
-      <w:bookmarkEnd w:id="9"/>
+      <w:bookmarkEnd w:id="10"/>
     </w:p>
     <w:p>
       <w:pPr>
@@ -3385,7 +3377,7 @@
           <w:lang w:val="en-US"/>
         </w:rPr>
       </w:pPr>
-      <w:bookmarkStart w:id="10" w:name="_Toc215160502"/>
+      <w:bookmarkStart w:id="11" w:name="_Toc215160502"/>
       <w:r>
         <w:rPr>
           <w:sz w:val="28"/>
@@ -3415,7 +3407,7 @@
         </w:rPr>
         <w:t>Ограничения</w:t>
       </w:r>
-      <w:bookmarkEnd w:id="10"/>
+      <w:bookmarkEnd w:id="11"/>
     </w:p>
     <w:p>
       <w:pPr>
@@ -3580,7 +3572,7 @@
           <w:szCs w:val="28"/>
         </w:rPr>
       </w:pPr>
-      <w:bookmarkStart w:id="11" w:name="_Toc215160503"/>
+      <w:bookmarkStart w:id="12" w:name="_Toc215160503"/>
       <w:r>
         <w:rPr>
           <w:sz w:val="28"/>
@@ -3589,18 +3581,18 @@
         <w:lastRenderedPageBreak/>
         <w:t>Анализ использования</w:t>
       </w:r>
-      <w:bookmarkEnd w:id="11"/>
+      <w:bookmarkEnd w:id="12"/>
     </w:p>
     <w:p>
       <w:pPr>
         <w:pStyle w:val="3"/>
         <w:spacing w:before="240"/>
       </w:pPr>
-      <w:bookmarkStart w:id="12" w:name="_Toc215160504"/>
+      <w:bookmarkStart w:id="13" w:name="_Toc215160504"/>
       <w:r>
         <w:t>Пользователи</w:t>
       </w:r>
-      <w:bookmarkEnd w:id="12"/>
+      <w:bookmarkEnd w:id="13"/>
     </w:p>
     <w:p>
       <w:pPr>
@@ -3668,11 +3660,11 @@
         <w:pStyle w:val="3"/>
         <w:spacing w:before="240"/>
       </w:pPr>
-      <w:bookmarkStart w:id="13" w:name="_Toc215160505"/>
+      <w:bookmarkStart w:id="14" w:name="_Toc215160505"/>
       <w:r>
         <w:t>Сценарии использования</w:t>
       </w:r>
-      <w:bookmarkEnd w:id="13"/>
+      <w:bookmarkEnd w:id="14"/>
     </w:p>
     <w:p>
       <w:pPr>
@@ -4594,7 +4586,7 @@
           <w:lang w:val="en-US"/>
         </w:rPr>
       </w:pPr>
-      <w:bookmarkStart w:id="14" w:name="_Toc215160506"/>
+      <w:bookmarkStart w:id="15" w:name="_Toc215160506"/>
       <w:r>
         <w:rPr>
           <w:sz w:val="28"/>
@@ -4602,7 +4594,7 @@
         </w:rPr>
         <w:t>Требования</w:t>
       </w:r>
-      <w:bookmarkEnd w:id="14"/>
+      <w:bookmarkEnd w:id="15"/>
     </w:p>
     <w:p>
       <w:pPr>
@@ -4612,14 +4604,14 @@
           <w:szCs w:val="28"/>
         </w:rPr>
       </w:pPr>
-      <w:bookmarkStart w:id="15" w:name="_Toc215160507"/>
+      <w:bookmarkStart w:id="16" w:name="_Toc215160507"/>
       <w:r>
         <w:rPr>
           <w:szCs w:val="28"/>
         </w:rPr>
         <w:t>Требования пользователей</w:t>
       </w:r>
-      <w:bookmarkEnd w:id="15"/>
+      <w:bookmarkEnd w:id="16"/>
     </w:p>
     <w:p>
       <w:pPr>
@@ -4868,14 +4860,14 @@
           <w:szCs w:val="28"/>
         </w:rPr>
       </w:pPr>
-      <w:bookmarkStart w:id="16" w:name="_Toc215160508"/>
+      <w:bookmarkStart w:id="17" w:name="_Toc215160508"/>
       <w:r>
         <w:rPr>
           <w:szCs w:val="28"/>
         </w:rPr>
         <w:t>Системные требования</w:t>
       </w:r>
-      <w:bookmarkEnd w:id="16"/>
+      <w:bookmarkEnd w:id="17"/>
     </w:p>
     <w:p>
       <w:pPr>
@@ -4895,7 +4887,6 @@
         </w:numPr>
         <w:spacing w:after="0" w:line="360" w:lineRule="auto"/>
       </w:pPr>
-      <w:bookmarkStart w:id="17" w:name="_GoBack"/>
       <w:r>
         <w:t>Система должна быть реализована как веб-приложение.</w:t>
       </w:r>
@@ -4944,7 +4935,6 @@
       <w:r>
         <w:t>Система должна быть развернута на доступном сервере.</w:t>
       </w:r>
-      <w:bookmarkEnd w:id="17"/>
       <w:r>
         <w:br w:type="page"/>
       </w:r>
@@ -6185,10 +6175,10 @@
         </w:rPr>
       </w:pPr>
       <w:bookmarkStart w:id="24" w:name="_Toc215160515"/>
-      <w:bookmarkEnd w:id="0"/>
       <w:bookmarkEnd w:id="1"/>
       <w:bookmarkEnd w:id="2"/>
       <w:bookmarkEnd w:id="3"/>
+      <w:bookmarkEnd w:id="4"/>
       <w:r>
         <w:rPr>
           <w:sz w:val="28"/>
@@ -12066,7 +12056,7 @@
 </file>
 
 <file path=customXml/itemProps1.xml><?xml version="1.0" encoding="utf-8"?>
-<ds:datastoreItem xmlns:ds="http://schemas.openxmlformats.org/officeDocument/2006/customXml" ds:itemID="{898CC6F3-4569-4040-B6B7-EF2942B5BECA}">
+<ds:datastoreItem xmlns:ds="http://schemas.openxmlformats.org/officeDocument/2006/customXml" ds:itemID="{C495CCC3-E9C6-42FF-A065-C81CFC4D50E4}">
   <ds:schemaRefs>
     <ds:schemaRef ds:uri="http://schemas.openxmlformats.org/officeDocument/2006/bibliography"/>
   </ds:schemaRefs>

</xml_diff>